<commit_message>
[v1.1.77] fix: update static blank letterhead docx template with watermark and clean borders
</commit_message>
<xml_diff>
--- a/public/templates/madrasah_letterhead_blank.docx
+++ b/public/templates/madrasah_letterhead_blank.docx
@@ -10,19 +10,19 @@
           <w:left w:val="none" w:color="auto" w:sz="0"/>
           <w:bottom w:val="none" w:color="auto" w:sz="0"/>
           <w:right w:val="none" w:color="auto" w:sz="0"/>
-          <w:insideH w:val="single" w:color="auto" w:sz="4"/>
-          <w:insideV w:val="single" w:color="auto" w:sz="4"/>
+          <w:insideH w:val="none" w:color="auto" w:sz="0"/>
+          <w:insideV w:val="none" w:color="auto" w:sz="0"/>
         </w:tblBorders>
       </w:tblPr>
       <w:tblGrid>
-        <w:gridCol w:w="2852"/>
-        <w:gridCol w:w="4482"/>
-        <w:gridCol w:w="2852"/>
+        <w:gridCol w:w="2617"/>
+        <w:gridCol w:w="5233"/>
+        <w:gridCol w:w="2617"/>
       </w:tblGrid>
       <w:tr>
         <w:tc>
           <w:tcPr>
-            <w:tcW w:type="pct" w:w="1400"/>
+            <w:tcW w:type="pct" w:w="1250"/>
             <w:tcBorders>
               <w:top w:val="none" w:color="auto" w:sz="0"/>
               <w:left w:val="none" w:color="auto" w:sz="0"/>
@@ -34,7 +34,7 @@
         </w:tc>
         <w:tc>
           <w:tcPr>
-            <w:tcW w:type="pct" w:w="2200"/>
+            <w:tcW w:type="pct" w:w="2500"/>
             <w:tcBorders>
               <w:top w:val="none" w:color="auto" w:sz="0"/>
               <w:left w:val="none" w:color="auto" w:sz="0"/>
@@ -53,230 +53,6 @@
                   <wp:extent cx="3143250" cy="495300"/>
                   <wp:effectExtent t="0" r="0" b="0" l="0"/>
                   <wp:docPr id="1" name="" descr="" title=""/>
-                  <wp:cNvGraphicFramePr>
-                    <a:graphicFrameLocks xmlns:a="http://schemas.openxmlformats.org/drawingml/2006/main" noChangeAspect="1"/>
-                  </wp:cNvGraphicFramePr>
-                  <a:graphic xmlns:a="http://schemas.openxmlformats.org/drawingml/2006/main">
-                    <a:graphicData uri="http://schemas.openxmlformats.org/drawingml/2006/picture">
-                      <pic:pic xmlns:pic="http://schemas.openxmlformats.org/drawingml/2006/picture">
-                        <pic:nvPicPr>
-                          <pic:cNvPr id="0" name="" descr=""/>
-                          <pic:cNvPicPr>
-                            <a:picLocks noChangeAspect="1" noChangeArrowheads="1"/>
-                          </pic:cNvPicPr>
-                        </pic:nvPicPr>
-                        <pic:blipFill>
-                          <a:blip r:embed="rId7" cstate="none"/>
-                          <a:srcRect/>
-                          <a:stretch>
-                            <a:fillRect/>
-                          </a:stretch>
-                        </pic:blipFill>
-                        <pic:spPr bwMode="auto">
-                          <a:xfrm>
-                            <a:off x="0" y="0"/>
-                            <a:ext cx="3143250" cy="495300"/>
-                          </a:xfrm>
-                          <a:prstGeom prst="rect">
-                            <a:avLst/>
-                          </a:prstGeom>
-                        </pic:spPr>
-                      </pic:pic>
-                    </a:graphicData>
-                  </a:graphic>
-                </wp:inline>
-              </w:drawing>
-            </w:r>
-          </w:p>
-        </w:tc>
-        <w:tc>
-          <w:tcPr>
-            <w:tcW w:type="pct" w:w="1400"/>
-            <w:tcBorders>
-              <w:top w:val="single" w:color="86efac" w:sz="4"/>
-              <w:left w:val="single" w:color="86efac" w:sz="4"/>
-              <w:bottom w:val="single" w:color="86efac" w:sz="4"/>
-              <w:right w:val="single" w:color="059669" w:sz="18"/>
-            </w:tcBorders>
-            <w:shd w:fill="f0fdf4" w:val="clear"/>
-            <w:vAlign w:val="center"/>
-          </w:tcPr>
-          <w:p>
-            <w:pPr>
-              <w:spacing w:after="0" w:line="240"/>
-              <w:jc w:val="right"/>
-            </w:pPr>
-            <w:r>
-              <w:rPr>
-                <w:rFonts w:ascii="SolaimanLipi" w:cs="SolaimanLipi" w:eastAsia="SolaimanLipi" w:hAnsi="SolaimanLipi"/>
-                <w:b/>
-                <w:bCs/>
-                <w:color w:val="065f46"/>
-                <w:sz w:val="15"/>
-                <w:szCs w:val="15"/>
-              </w:rPr>
-              <w:t xml:space="preserve">❝ ইলম শিখো, আমল করো,</w:t>
-            </w:r>
-          </w:p>
-          <w:p>
-            <w:pPr>
-              <w:spacing w:after="0" w:line="240"/>
-              <w:jc w:val="right"/>
-            </w:pPr>
-            <w:r>
-              <w:rPr>
-                <w:rFonts w:ascii="SolaimanLipi" w:cs="SolaimanLipi" w:eastAsia="SolaimanLipi" w:hAnsi="SolaimanLipi"/>
-                <w:b/>
-                <w:bCs/>
-                <w:color w:val="065f46"/>
-                <w:sz w:val="15"/>
-                <w:szCs w:val="15"/>
-              </w:rPr>
-              <w:t xml:space="preserve">মানুষের সেবায় নিজেকে গড়ো। ❞</w:t>
-            </w:r>
-          </w:p>
-        </w:tc>
-      </w:tr>
-    </w:tbl>
-    <w:p>
-      <w:pPr>
-        <w:spacing w:after="140"/>
-      </w:pPr>
-    </w:p>
-    <w:tbl>
-      <w:tblPr>
-        <w:tblW w:type="pct" w:w="5000"/>
-        <w:tblBorders>
-          <w:top w:val="none" w:color="auto" w:sz="0"/>
-          <w:left w:val="none" w:color="auto" w:sz="0"/>
-          <w:bottom w:val="none" w:color="auto" w:sz="0"/>
-          <w:right w:val="none" w:color="auto" w:sz="0"/>
-          <w:insideH w:val="single" w:color="auto" w:sz="4"/>
-          <w:insideV w:val="single" w:color="auto" w:sz="4"/>
-        </w:tblBorders>
-      </w:tblPr>
-      <w:tblGrid>
-        <w:gridCol w:w="4278"/>
-        <w:gridCol w:w="1630"/>
-        <w:gridCol w:w="4278"/>
-      </w:tblGrid>
-      <w:tr>
-        <w:tc>
-          <w:tcPr>
-            <w:tcW w:type="pct" w:w="2100"/>
-            <w:tcBorders>
-              <w:top w:val="none" w:color="auto" w:sz="0"/>
-              <w:left w:val="none" w:color="auto" w:sz="0"/>
-              <w:bottom w:val="none" w:color="auto" w:sz="0"/>
-              <w:right w:val="none" w:color="auto" w:sz="0"/>
-            </w:tcBorders>
-            <w:vAlign w:val="top"/>
-          </w:tcPr>
-          <w:p>
-            <w:pPr>
-              <w:spacing w:after="20"/>
-            </w:pPr>
-            <w:r>
-              <w:rPr>
-                <w:rFonts w:ascii="SolaimanLipi" w:cs="SolaimanLipi" w:eastAsia="SolaimanLipi" w:hAnsi="SolaimanLipi"/>
-                <w:b/>
-                <w:bCs/>
-                <w:color w:val="020617"/>
-                <w:sz w:val="26"/>
-                <w:szCs w:val="26"/>
-              </w:rPr>
-              <w:t xml:space="preserve">আন্-নূর ইসলামিক একাডেমি</w:t>
-            </w:r>
-          </w:p>
-          <w:p>
-            <w:r>
-              <w:rPr>
-                <w:rFonts w:ascii="SolaimanLipi" w:cs="SolaimanLipi" w:eastAsia="SolaimanLipi" w:hAnsi="SolaimanLipi"/>
-                <w:b/>
-                <w:bCs/>
-                <w:color w:val="1e293b"/>
-                <w:sz w:val="18"/>
-                <w:szCs w:val="18"/>
-              </w:rPr>
-              <w:t xml:space="preserve">শাহীবাগ জামে মসজিদ সংলগ্ন,</w:t>
-            </w:r>
-          </w:p>
-          <w:p>
-            <w:pPr>
-              <w:spacing w:after="60"/>
-            </w:pPr>
-            <w:r>
-              <w:rPr>
-                <w:rFonts w:ascii="SolaimanLipi" w:cs="SolaimanLipi" w:eastAsia="SolaimanLipi" w:hAnsi="SolaimanLipi"/>
-                <w:b/>
-                <w:bCs/>
-                <w:color w:val="1e293b"/>
-                <w:sz w:val="18"/>
-                <w:szCs w:val="18"/>
-              </w:rPr>
-              <w:t xml:space="preserve">চাঁপাইনবাবগঞ্জ।</w:t>
-            </w:r>
-          </w:p>
-          <w:p>
-            <w:r>
-              <w:rPr>
-                <w:rFonts w:ascii="SolaimanLipi" w:cs="SolaimanLipi" w:eastAsia="SolaimanLipi" w:hAnsi="SolaimanLipi"/>
-                <w:color w:val="334155"/>
-                <w:sz w:val="16"/>
-                <w:szCs w:val="16"/>
-              </w:rPr>
-              <w:t xml:space="preserve">হুফফাজুল কুরআন ফাউন্ডেশন</w:t>
-            </w:r>
-          </w:p>
-          <w:p>
-            <w:pPr>
-              <w:spacing w:after="60"/>
-            </w:pPr>
-            <w:r>
-              <w:rPr>
-                <w:rFonts w:ascii="SolaimanLipi" w:cs="SolaimanLipi" w:eastAsia="SolaimanLipi" w:hAnsi="SolaimanLipi"/>
-                <w:color w:val="334155"/>
-                <w:sz w:val="16"/>
-                <w:szCs w:val="16"/>
-              </w:rPr>
-              <w:t xml:space="preserve">বাংলাদেশ হিফজ শিক্ষা বোর্ড (নিবন্ধন: ৫০০৮২৫)</w:t>
-            </w:r>
-          </w:p>
-          <w:p>
-            <w:r>
-              <w:rPr>
-                <w:rFonts w:ascii="SolaimanLipi" w:cs="SolaimanLipi" w:eastAsia="SolaimanLipi" w:hAnsi="SolaimanLipi"/>
-                <w:b/>
-                <w:bCs/>
-                <w:color w:val="047857"/>
-                <w:sz w:val="16"/>
-                <w:szCs w:val="16"/>
-              </w:rPr>
-              <w:t xml:space="preserve"> ০১৭৬৭৬১৫৭৪৬ (পরিচালক) </w:t>
-            </w:r>
-          </w:p>
-        </w:tc>
-        <w:tc>
-          <w:tcPr>
-            <w:tcW w:type="pct" w:w="800"/>
-            <w:tcBorders>
-              <w:top w:val="none" w:color="auto" w:sz="0"/>
-              <w:left w:val="none" w:color="auto" w:sz="0"/>
-              <w:bottom w:val="none" w:color="auto" w:sz="0"/>
-              <w:right w:val="none" w:color="auto" w:sz="0"/>
-            </w:tcBorders>
-            <w:vAlign w:val="center"/>
-          </w:tcPr>
-          <w:p>
-            <w:pPr>
-              <w:jc w:val="center"/>
-            </w:pPr>
-            <w:r>
-              <w:drawing>
-                <wp:inline distT="0" distB="0" distL="0" distR="0">
-                  <wp:extent cx="857250" cy="857250"/>
-                  <wp:effectExtent t="0" r="0" b="0" l="0"/>
-                  <wp:docPr id="2" name="" descr="" title=""/>
                   <wp:cNvGraphicFramePr>
                     <a:graphicFrameLocks xmlns:a="http://schemas.openxmlformats.org/drawingml/2006/main" noChangeAspect="1"/>
                   </wp:cNvGraphicFramePr>
@@ -299,7 +75,7 @@
                         <pic:spPr bwMode="auto">
                           <a:xfrm>
                             <a:off x="0" y="0"/>
-                            <a:ext cx="857250" cy="857250"/>
+                            <a:ext cx="3143250" cy="495300"/>
                           </a:xfrm>
                           <a:prstGeom prst="rect">
                             <a:avLst/>
@@ -315,7 +91,115 @@
         </w:tc>
         <w:tc>
           <w:tcPr>
-            <w:tcW w:type="pct" w:w="2100"/>
+            <w:tcW w:type="pct" w:w="1250"/>
+            <w:tcBorders>
+              <w:top w:val="none" w:color="auto" w:sz="0"/>
+              <w:left w:val="none" w:color="auto" w:sz="0"/>
+              <w:bottom w:val="none" w:color="auto" w:sz="0"/>
+              <w:right w:val="none" w:color="auto" w:sz="0"/>
+            </w:tcBorders>
+            <w:vAlign w:val="center"/>
+          </w:tcPr>
+          <w:tbl>
+            <w:tblPr>
+              <w:tblW w:type="auto" w:w="100"/>
+              <w:jc w:val="right"/>
+              <w:tblBorders>
+                <w:top w:val="single" w:color="86efac" w:sz="4"/>
+                <w:left w:val="single" w:color="86efac" w:sz="4"/>
+                <w:bottom w:val="single" w:color="86efac" w:sz="4"/>
+                <w:right w:val="single" w:color="059669" w:sz="16"/>
+                <w:insideH w:val="none" w:color="auto" w:sz="0"/>
+                <w:insideV w:val="none" w:color="auto" w:sz="0"/>
+              </w:tblBorders>
+            </w:tblPr>
+            <w:tblGrid>
+              <w:gridCol w:w="2617"/>
+            </w:tblGrid>
+            <w:tr>
+              <w:tc>
+                <w:tcPr>
+                  <w:tcBorders>
+                    <w:top w:val="single" w:color="86efac" w:sz="4"/>
+                    <w:left w:val="single" w:color="86efac" w:sz="4"/>
+                    <w:bottom w:val="single" w:color="86efac" w:sz="4"/>
+                    <w:right w:val="single" w:color="059669" w:sz="16"/>
+                  </w:tcBorders>
+                  <w:shd w:fill="f0fdf4" w:val="clear"/>
+                  <w:tcMar>
+                    <w:top w:type="dxa" w:w="60"/>
+                    <w:left w:type="dxa" w:w="100"/>
+                    <w:bottom w:type="dxa" w:w="60"/>
+                    <w:right w:type="dxa" w:w="100"/>
+                  </w:tcMar>
+                </w:tcPr>
+                <w:p>
+                  <w:pPr>
+                    <w:spacing w:after="20" w:line="220"/>
+                    <w:jc w:val="right"/>
+                  </w:pPr>
+                  <w:r>
+                    <w:rPr>
+                      <w:rFonts w:ascii="SolaimanLipi" w:cs="SolaimanLipi" w:eastAsia="SolaimanLipi" w:hAnsi="SolaimanLipi"/>
+                      <w:b/>
+                      <w:bCs/>
+                      <w:color w:val="065f46"/>
+                      <w:sz w:val="15"/>
+                      <w:szCs w:val="15"/>
+                    </w:rPr>
+                    <w:t xml:space="preserve">❝ ইলম শিখো, আমল করো,</w:t>
+                  </w:r>
+                </w:p>
+                <w:p>
+                  <w:pPr>
+                    <w:spacing w:after="0" w:line="220"/>
+                    <w:jc w:val="right"/>
+                  </w:pPr>
+                  <w:r>
+                    <w:rPr>
+                      <w:rFonts w:ascii="SolaimanLipi" w:cs="SolaimanLipi" w:eastAsia="SolaimanLipi" w:hAnsi="SolaimanLipi"/>
+                      <w:b/>
+                      <w:bCs/>
+                      <w:color w:val="065f46"/>
+                      <w:sz w:val="15"/>
+                      <w:szCs w:val="15"/>
+                    </w:rPr>
+                    <w:t xml:space="preserve">মানুষের সেবায় নিজেকে গড়ো। ❞</w:t>
+                  </w:r>
+                </w:p>
+              </w:tc>
+            </w:tr>
+          </w:tbl>
+          <w:p/>
+        </w:tc>
+      </w:tr>
+    </w:tbl>
+    <w:p>
+      <w:pPr>
+        <w:spacing w:after="100"/>
+      </w:pPr>
+    </w:p>
+    <w:tbl>
+      <w:tblPr>
+        <w:tblW w:type="pct" w:w="5000"/>
+        <w:tblBorders>
+          <w:top w:val="none" w:color="auto" w:sz="0"/>
+          <w:left w:val="none" w:color="auto" w:sz="0"/>
+          <w:bottom w:val="none" w:color="auto" w:sz="0"/>
+          <w:right w:val="none" w:color="auto" w:sz="0"/>
+          <w:insideH w:val="none" w:color="auto" w:sz="0"/>
+          <w:insideV w:val="none" w:color="auto" w:sz="0"/>
+        </w:tblBorders>
+      </w:tblPr>
+      <w:tblGrid>
+        <w:gridCol w:w="4291"/>
+        <w:gridCol w:w="1884"/>
+        <w:gridCol w:w="4291"/>
+      </w:tblGrid>
+      <w:tr>
+        <w:tc>
+          <w:tcPr>
+            <w:tcW w:type="pct" w:w="2050"/>
             <w:tcBorders>
               <w:top w:val="none" w:color="auto" w:sz="0"/>
               <w:left w:val="none" w:color="auto" w:sz="0"/>
@@ -327,6 +211,194 @@
           <w:p>
             <w:pPr>
               <w:spacing w:after="20"/>
+            </w:pPr>
+            <w:r>
+              <w:rPr>
+                <w:rFonts w:ascii="SolaimanLipi" w:cs="SolaimanLipi" w:eastAsia="SolaimanLipi" w:hAnsi="SolaimanLipi"/>
+                <w:b/>
+                <w:bCs/>
+                <w:color w:val="020617"/>
+                <w:sz w:val="26"/>
+                <w:szCs w:val="26"/>
+              </w:rPr>
+              <w:t xml:space="preserve">আন্-নূর ইসলামিক একাডেমি</w:t>
+            </w:r>
+          </w:p>
+          <w:p>
+            <w:r>
+              <w:rPr>
+                <w:rFonts w:ascii="SolaimanLipi" w:cs="SolaimanLipi" w:eastAsia="SolaimanLipi" w:hAnsi="SolaimanLipi"/>
+                <w:b/>
+                <w:bCs/>
+                <w:color w:val="1e293b"/>
+                <w:sz w:val="18"/>
+                <w:szCs w:val="18"/>
+              </w:rPr>
+              <w:t xml:space="preserve">শাহীবাগ জামে মসজিদ সংলগ্ন,</w:t>
+            </w:r>
+          </w:p>
+          <w:p>
+            <w:pPr>
+              <w:spacing w:after="60"/>
+            </w:pPr>
+            <w:r>
+              <w:rPr>
+                <w:rFonts w:ascii="SolaimanLipi" w:cs="SolaimanLipi" w:eastAsia="SolaimanLipi" w:hAnsi="SolaimanLipi"/>
+                <w:b/>
+                <w:bCs/>
+                <w:color w:val="1e293b"/>
+                <w:sz w:val="18"/>
+                <w:szCs w:val="18"/>
+              </w:rPr>
+              <w:t xml:space="preserve">চাঁপাইনবাবগঞ্জ।</w:t>
+            </w:r>
+          </w:p>
+          <w:p>
+            <w:r>
+              <w:rPr>
+                <w:rFonts w:ascii="SolaimanLipi" w:cs="SolaimanLipi" w:eastAsia="SolaimanLipi" w:hAnsi="SolaimanLipi"/>
+                <w:color w:val="334155"/>
+                <w:sz w:val="16"/>
+                <w:szCs w:val="16"/>
+              </w:rPr>
+              <w:t xml:space="preserve">হুফফাজুল কুরআন ফাউন্ডেশন</w:t>
+            </w:r>
+          </w:p>
+          <w:p>
+            <w:pPr>
+              <w:spacing w:after="60"/>
+            </w:pPr>
+            <w:r>
+              <w:rPr>
+                <w:rFonts w:ascii="SolaimanLipi" w:cs="SolaimanLipi" w:eastAsia="SolaimanLipi" w:hAnsi="SolaimanLipi"/>
+                <w:color w:val="334155"/>
+                <w:sz w:val="16"/>
+                <w:szCs w:val="16"/>
+              </w:rPr>
+              <w:t xml:space="preserve">বাংলাদেশ হিফজ শিক্ষা বোর্ড (নিবন্ধন: ৫০০৮২৫)</w:t>
+            </w:r>
+          </w:p>
+          <w:tbl>
+            <w:tblPr>
+              <w:tblW w:type="auto" w:w="100"/>
+              <w:tblBorders>
+                <w:top w:val="single" w:color="cbd5e1" w:sz="4"/>
+                <w:left w:val="single" w:color="cbd5e1" w:sz="4"/>
+                <w:bottom w:val="single" w:color="cbd5e1" w:sz="4"/>
+                <w:right w:val="single" w:color="cbd5e1" w:sz="4"/>
+                <w:insideH w:val="none" w:color="auto" w:sz="0"/>
+                <w:insideV w:val="none" w:color="auto" w:sz="0"/>
+              </w:tblBorders>
+            </w:tblPr>
+            <w:tblGrid>
+              <w:gridCol w:w="4291"/>
+            </w:tblGrid>
+            <w:tr>
+              <w:tc>
+                <w:tcPr>
+                  <w:tcBorders>
+                    <w:top w:val="single" w:color="cbd5e1" w:sz="4"/>
+                    <w:left w:val="single" w:color="cbd5e1" w:sz="4"/>
+                    <w:bottom w:val="single" w:color="cbd5e1" w:sz="4"/>
+                    <w:right w:val="single" w:color="cbd5e1" w:sz="4"/>
+                  </w:tcBorders>
+                  <w:shd w:fill="f1f5f9" w:val="clear"/>
+                  <w:tcMar>
+                    <w:top w:type="dxa" w:w="40"/>
+                    <w:left w:type="dxa" w:w="100"/>
+                    <w:bottom w:type="dxa" w:w="40"/>
+                    <w:right w:type="dxa" w:w="100"/>
+                  </w:tcMar>
+                </w:tcPr>
+                <w:p>
+                  <w:r>
+                    <w:rPr>
+                      <w:rFonts w:ascii="SolaimanLipi" w:cs="SolaimanLipi" w:eastAsia="SolaimanLipi" w:hAnsi="SolaimanLipi"/>
+                      <w:b/>
+                      <w:bCs/>
+                      <w:color w:val="047857"/>
+                      <w:sz w:val="16"/>
+                      <w:szCs w:val="16"/>
+                    </w:rPr>
+                    <w:t xml:space="preserve">০১৭৬৭৬১৫৭৪৬ (পরিচালক)</w:t>
+                  </w:r>
+                </w:p>
+              </w:tc>
+            </w:tr>
+          </w:tbl>
+          <w:p/>
+        </w:tc>
+        <w:tc>
+          <w:tcPr>
+            <w:tcW w:type="pct" w:w="900"/>
+            <w:tcBorders>
+              <w:top w:val="none" w:color="auto" w:sz="0"/>
+              <w:left w:val="none" w:color="auto" w:sz="0"/>
+              <w:bottom w:val="none" w:color="auto" w:sz="0"/>
+              <w:right w:val="none" w:color="auto" w:sz="0"/>
+            </w:tcBorders>
+            <w:vAlign w:val="center"/>
+          </w:tcPr>
+          <w:p>
+            <w:pPr>
+              <w:jc w:val="center"/>
+            </w:pPr>
+            <w:r>
+              <w:drawing>
+                <wp:inline distT="0" distB="0" distL="0" distR="0">
+                  <wp:extent cx="876300" cy="876300"/>
+                  <wp:effectExtent t="0" r="0" b="0" l="0"/>
+                  <wp:docPr id="2" name="" descr="" title=""/>
+                  <wp:cNvGraphicFramePr>
+                    <a:graphicFrameLocks xmlns:a="http://schemas.openxmlformats.org/drawingml/2006/main" noChangeAspect="1"/>
+                  </wp:cNvGraphicFramePr>
+                  <a:graphic xmlns:a="http://schemas.openxmlformats.org/drawingml/2006/main">
+                    <a:graphicData uri="http://schemas.openxmlformats.org/drawingml/2006/picture">
+                      <pic:pic xmlns:pic="http://schemas.openxmlformats.org/drawingml/2006/picture">
+                        <pic:nvPicPr>
+                          <pic:cNvPr id="0" name="" descr=""/>
+                          <pic:cNvPicPr>
+                            <a:picLocks noChangeAspect="1" noChangeArrowheads="1"/>
+                          </pic:cNvPicPr>
+                        </pic:nvPicPr>
+                        <pic:blipFill>
+                          <a:blip r:embed="rId9" cstate="none"/>
+                          <a:srcRect/>
+                          <a:stretch>
+                            <a:fillRect/>
+                          </a:stretch>
+                        </pic:blipFill>
+                        <pic:spPr bwMode="auto">
+                          <a:xfrm>
+                            <a:off x="0" y="0"/>
+                            <a:ext cx="876300" cy="876300"/>
+                          </a:xfrm>
+                          <a:prstGeom prst="rect">
+                            <a:avLst/>
+                          </a:prstGeom>
+                        </pic:spPr>
+                      </pic:pic>
+                    </a:graphicData>
+                  </a:graphic>
+                </wp:inline>
+              </w:drawing>
+            </w:r>
+          </w:p>
+        </w:tc>
+        <w:tc>
+          <w:tcPr>
+            <w:tcW w:type="pct" w:w="2050"/>
+            <w:tcBorders>
+              <w:top w:val="none" w:color="auto" w:sz="0"/>
+              <w:left w:val="none" w:color="auto" w:sz="0"/>
+              <w:bottom w:val="none" w:color="auto" w:sz="0"/>
+              <w:right w:val="none" w:color="auto" w:sz="0"/>
+            </w:tcBorders>
+            <w:vAlign w:val="top"/>
+          </w:tcPr>
+          <w:p>
+            <w:pPr>
+              <w:spacing w:after="20"/>
               <w:jc w:val="right"/>
             </w:pPr>
             <w:r>
@@ -403,44 +475,81 @@
               <w:t xml:space="preserve">নূরানী ইকরা বোর্ড- নিবন্ধন নং: ৬০২৫৪২</w:t>
             </w:r>
           </w:p>
-          <w:p>
-            <w:pPr>
+          <w:tbl>
+            <w:tblPr>
+              <w:tblW w:type="auto" w:w="100"/>
               <w:jc w:val="right"/>
-            </w:pPr>
-            <w:r>
-              <w:rPr>
-                <w:rFonts w:ascii="SolaimanLipi" w:cs="SolaimanLipi" w:eastAsia="SolaimanLipi" w:hAnsi="SolaimanLipi"/>
-                <w:b/>
-                <w:bCs/>
-                <w:color w:val="047857"/>
-                <w:sz w:val="16"/>
-                <w:szCs w:val="16"/>
-              </w:rPr>
-              <w:t xml:space="preserve"> ০১৭২২০৯৫০২৬ (প্রধান শিক্ষক-নূরানী বিভাগ) </w:t>
-            </w:r>
-          </w:p>
+              <w:tblBorders>
+                <w:top w:val="single" w:color="cbd5e1" w:sz="4"/>
+                <w:left w:val="single" w:color="cbd5e1" w:sz="4"/>
+                <w:bottom w:val="single" w:color="cbd5e1" w:sz="4"/>
+                <w:right w:val="single" w:color="cbd5e1" w:sz="4"/>
+                <w:insideH w:val="none" w:color="auto" w:sz="0"/>
+                <w:insideV w:val="none" w:color="auto" w:sz="0"/>
+              </w:tblBorders>
+            </w:tblPr>
+            <w:tblGrid>
+              <w:gridCol w:w="4291"/>
+            </w:tblGrid>
+            <w:tr>
+              <w:tc>
+                <w:tcPr>
+                  <w:tcBorders>
+                    <w:top w:val="single" w:color="cbd5e1" w:sz="4"/>
+                    <w:left w:val="single" w:color="cbd5e1" w:sz="4"/>
+                    <w:bottom w:val="single" w:color="cbd5e1" w:sz="4"/>
+                    <w:right w:val="single" w:color="cbd5e1" w:sz="4"/>
+                  </w:tcBorders>
+                  <w:shd w:fill="f1f5f9" w:val="clear"/>
+                  <w:tcMar>
+                    <w:top w:type="dxa" w:w="40"/>
+                    <w:left w:type="dxa" w:w="100"/>
+                    <w:bottom w:type="dxa" w:w="40"/>
+                    <w:right w:type="dxa" w:w="100"/>
+                  </w:tcMar>
+                </w:tcPr>
+                <w:p>
+                  <w:pPr>
+                    <w:jc w:val="right"/>
+                  </w:pPr>
+                  <w:r>
+                    <w:rPr>
+                      <w:rFonts w:ascii="SolaimanLipi" w:cs="SolaimanLipi" w:eastAsia="SolaimanLipi" w:hAnsi="SolaimanLipi"/>
+                      <w:b/>
+                      <w:bCs/>
+                      <w:color w:val="047857"/>
+                      <w:sz w:val="16"/>
+                      <w:szCs w:val="16"/>
+                    </w:rPr>
+                    <w:t xml:space="preserve">০১৭২২০৯৫০২৬ (প্রধান শিক্ষক-নূরানী বিভাগ)</w:t>
+                  </w:r>
+                </w:p>
+              </w:tc>
+            </w:tr>
+          </w:tbl>
+          <w:p/>
         </w:tc>
       </w:tr>
     </w:tbl>
     <w:p>
       <w:pPr>
-        <w:spacing w:after="100"/>
+        <w:spacing w:after="60"/>
       </w:pPr>
     </w:p>
     <w:tbl>
       <w:tblPr>
         <w:tblW w:type="pct" w:w="5000"/>
         <w:tblBorders>
-          <w:top w:val="single" w:color="0f172a" w:sz="16"/>
+          <w:top w:val="double" w:color="0f172a" w:sz="12"/>
           <w:left w:val="none" w:color="auto" w:sz="0"/>
           <w:bottom w:val="none" w:color="auto" w:sz="0"/>
           <w:right w:val="none" w:color="auto" w:sz="0"/>
-          <w:insideH w:val="single" w:color="auto" w:sz="4"/>
-          <w:insideV w:val="single" w:color="auto" w:sz="4"/>
+          <w:insideH w:val="none" w:color="auto" w:sz="0"/>
+          <w:insideV w:val="none" w:color="auto" w:sz="0"/>
         </w:tblBorders>
       </w:tblPr>
       <w:tblGrid>
-        <w:gridCol w:w="10186"/>
+        <w:gridCol w:w="10466"/>
       </w:tblGrid>
       <w:tr>
         <w:tc>
@@ -454,12 +563,47 @@
           </w:tcPr>
           <w:p>
             <w:pPr>
-              <w:spacing w:after="120"/>
+              <w:spacing w:after="20"/>
             </w:pPr>
           </w:p>
         </w:tc>
       </w:tr>
     </w:tbl>
+    <w:p>
+      <w:pPr>
+        <w:spacing w:after="240"/>
+      </w:pPr>
+    </w:p>
+    <w:p>
+      <w:pPr>
+        <w:spacing w:after="240"/>
+      </w:pPr>
+    </w:p>
+    <w:p>
+      <w:pPr>
+        <w:spacing w:after="240"/>
+      </w:pPr>
+    </w:p>
+    <w:p>
+      <w:pPr>
+        <w:spacing w:after="240"/>
+      </w:pPr>
+    </w:p>
+    <w:p>
+      <w:pPr>
+        <w:spacing w:after="240"/>
+      </w:pPr>
+    </w:p>
+    <w:p>
+      <w:pPr>
+        <w:spacing w:after="240"/>
+      </w:pPr>
+    </w:p>
+    <w:p>
+      <w:pPr>
+        <w:spacing w:after="240"/>
+      </w:pPr>
+    </w:p>
     <w:p>
       <w:pPr>
         <w:spacing w:after="240"/>
@@ -493,13 +637,13 @@
           <w:left w:val="none" w:color="auto" w:sz="0"/>
           <w:bottom w:val="none" w:color="auto" w:sz="0"/>
           <w:right w:val="none" w:color="auto" w:sz="0"/>
-          <w:insideH w:val="single" w:color="auto" w:sz="4"/>
-          <w:insideV w:val="single" w:color="auto" w:sz="4"/>
+          <w:insideH w:val="none" w:color="auto" w:sz="0"/>
+          <w:insideV w:val="none" w:color="auto" w:sz="0"/>
         </w:tblBorders>
       </w:tblPr>
       <w:tblGrid>
-        <w:gridCol w:w="5093"/>
-        <w:gridCol w:w="5093"/>
+        <w:gridCol w:w="5233"/>
+        <w:gridCol w:w="5233"/>
       </w:tblGrid>
       <w:tr>
         <w:tc>
@@ -514,7 +658,7 @@
           </w:tcPr>
           <w:p>
             <w:pPr>
-              <w:spacing w:before="200"/>
+              <w:spacing w:after="40" w:before="200"/>
               <w:jc w:val="center"/>
             </w:pPr>
             <w:r>
@@ -526,6 +670,7 @@
           </w:p>
           <w:p>
             <w:pPr>
+              <w:spacing w:after="20"/>
               <w:jc w:val="center"/>
             </w:pPr>
             <w:r>
@@ -567,7 +712,7 @@
           </w:tcPr>
           <w:p>
             <w:pPr>
-              <w:spacing w:before="200"/>
+              <w:spacing w:after="40" w:before="200"/>
               <w:jc w:val="center"/>
             </w:pPr>
             <w:r>
@@ -579,6 +724,7 @@
           </w:p>
           <w:p>
             <w:pPr>
+              <w:spacing w:after="20"/>
               <w:jc w:val="center"/>
             </w:pPr>
             <w:r>
@@ -590,7 +736,7 @@
                 <w:sz w:val="18"/>
                 <w:szCs w:val="18"/>
               </w:rPr>
-              <w:t xml:space="preserve">প্রতিষ্ঠান প্রধান</w:t>
+              <w:t xml:space="preserve">প্রতিষ্ঠান প্রধান / সভাপতি</w:t>
             </w:r>
           </w:p>
           <w:p>
@@ -611,8 +757,9 @@
       </w:tr>
     </w:tbl>
     <w:sectPr>
+      <w:headerReference w:type="default" r:id="rId6"/>
       <w:pgSz w:w="11906" w:h="16838" w:orient="portrait"/>
-      <w:pgMar w:top="720" w:right="860" w:bottom="720" w:left="860" w:header="708" w:footer="708" w:gutter="0"/>
+      <w:pgMar w:top="500" w:right="720" w:bottom="576" w:left="720" w:header="708" w:footer="708" w:gutter="0"/>
       <w:pgNumType/>
       <w:docGrid w:linePitch="360"/>
     </w:sectPr>
@@ -692,6 +839,39 @@
     </w:p>
   </w:footnote>
 </w:footnotes>
+</file>
+
+<file path=word/header1.xml><?xml version="1.0" encoding="utf-8"?>
+<w:hdr xmlns:wpc="http://schemas.microsoft.com/office/word/2010/wordprocessingCanvas" xmlns:mc="http://schemas.openxmlformats.org/markup-compatibility/2006" xmlns:o="urn:schemas-microsoft-com:office:office" xmlns:r="http://schemas.openxmlformats.org/officeDocument/2006/relationships" xmlns:m="http://schemas.openxmlformats.org/officeDocument/2006/math" xmlns:v="urn:schemas-microsoft-com:vml" xmlns:wp14="http://schemas.microsoft.com/office/word/2010/wordprocessingDrawing" xmlns:wp="http://schemas.openxmlformats.org/drawingml/2006/wordprocessingDrawing" xmlns:w10="urn:schemas-microsoft-com:office:word" xmlns:w="http://schemas.openxmlformats.org/wordprocessingml/2006/main" xmlns:w14="http://schemas.microsoft.com/office/word/2010/wordml" xmlns:w15="http://schemas.microsoft.com/office/word/2012/wordml" xmlns:wpg="http://schemas.microsoft.com/office/word/2010/wordprocessingGroup" xmlns:wpi="http://schemas.microsoft.com/office/word/2010/wordprocessingInk" xmlns:wne="http://schemas.microsoft.com/office/word/2006/wordml" xmlns:wps="http://schemas.microsoft.com/office/word/2010/wordprocessingShape" xmlns:cx="http://schemas.microsoft.com/office/drawing/2014/chartex" xmlns:cx1="http://schemas.microsoft.com/office/drawing/2015/9/8/chartex" xmlns:cx2="http://schemas.microsoft.com/office/drawing/2015/10/21/chartex" xmlns:cx3="http://schemas.microsoft.com/office/drawing/2016/5/9/chartex" xmlns:cx4="http://schemas.microsoft.com/office/drawing/2016/5/10/chartex" xmlns:cx5="http://schemas.microsoft.com/office/drawing/2016/5/11/chartex" xmlns:cx6="http://schemas.microsoft.com/office/drawing/2016/5/12/chartex" xmlns:cx7="http://schemas.microsoft.com/office/drawing/2016/5/13/chartex" xmlns:cx8="http://schemas.microsoft.com/office/drawing/2016/5/14/chartex" xmlns:w16cid="http://schemas.microsoft.com/office/word/2016/wordml/cid" xmlns:w16se="http://schemas.microsoft.com/office/word/2015/wordml/symex">
+  <w:p>
+    <w:r>
+      <w:pict>
+        <v:shapetype id="_x0000_t75" coordsize="21600,21600" o:spt="75" o:preferrelative="t" path="m@4@5l@4@11@9@11@9@5xe" filled="f" stroked="f">
+          <v:stroke joinstyle="miter"/>
+          <v:formulas>
+            <v:f eqn="if lineDrawn pixelLineWidth 0"/>
+            <v:f eqn="sum @0 1 0"/>
+            <v:f eqn="sum 0 0 @1"/>
+            <v:f eqn="prod @2 1 2"/>
+            <v:f eqn="prod @3 21600 pixelWidth"/>
+            <v:f eqn="prod @3 21600 pixelHeight"/>
+            <v:f eqn="sum @0 0 1"/>
+            <v:f eqn="prod @6 1 2"/>
+            <v:f eqn="prod @7 21600 pixelWidth"/>
+            <v:f eqn="sum @8 21600 0"/>
+            <v:f eqn="prod @7 21600 pixelHeight"/>
+            <v:f eqn="sum @10 21600 0"/>
+          </v:formulas>
+          <v:path gradientshapeok="t" o:extrusionok="f" o:connecttype="rect"/>
+          <o:lock v:ext="edit" aspectratio="t"/>
+        </v:shapetype>
+        <v:shape id="WordPictureWatermarklmwiiideg73prffabbdsc" type="#_x0000_t75" style="position:absolute;margin-left:0;margin-top:0;width:315pt;height:315pt;z-index:-251657216;mso-position-horizontal:center;mso-position-horizontal-relative:margin;mso-position-vertical:center;mso-position-vertical-relative:margin" o:allowincell="f">
+          <v:imagedata r:id="rId0" gain="19661f" blacklevel="22938f"/>
+        </v:shape>
+      </w:pict>
+    </w:r>
+  </w:p>
+</w:hdr>
 </file>
 
 <file path=word/numbering.xml><?xml version="1.0" encoding="utf-8"?>

</xml_diff>